<commit_message>
Complete Bài 3 UC Place Rush Order
</commit_message>
<xml_diff>
--- a/VIII.HUST/Phân tích và xây dựng phần mềm/01_Word/Bai_tap_03_202490077_BachMinhQuang.docx
+++ b/VIII.HUST/Phân tích và xây dựng phần mềm/01_Word/Bai_tap_03_202490077_BachMinhQuang.docx
@@ -1933,6 +1933,223 @@
         </w:rPr>
       </w:pPr>
     </w:p>
+    <w:tbl>
+      <w:tblPr>
+        <w:tblW w:type="auto" w:w="0"/>
+        <w:tblLayout w:type="fixed"/>
+        <w:tblLook w:firstColumn="1" w:firstRow="1" w:lastColumn="0" w:lastRow="0" w:noHBand="0" w:noVBand="1" w:val="04A0"/>
+        <w:tblBorders>
+          <w:top w:val="single" w:sz="6" w:space="0" w:color="8A8A8A"/>
+          <w:left w:val="single" w:sz="6" w:space="0" w:color="8A8A8A"/>
+          <w:bottom w:val="single" w:sz="6" w:space="0" w:color="8A8A8A"/>
+          <w:right w:val="single" w:sz="6" w:space="0" w:color="8A8A8A"/>
+          <w:insideH w:val="single" w:sz="6" w:space="0" w:color="8A8A8A"/>
+          <w:insideV w:val="single" w:sz="6" w:space="0" w:color="8A8A8A"/>
+        </w:tblBorders>
+      </w:tblPr>
+      <w:tblGrid>
+        <w:gridCol w:w="2952"/>
+        <w:gridCol w:w="2952"/>
+        <w:gridCol w:w="2952"/>
+      </w:tblGrid>
+      <w:tr>
+        <w:trPr>
+          <w:cantSplit/>
+        </w:trPr>
+        <w:tc>
+          <w:tcPr>
+            <w:tcW w:type="dxa" w:w="2952"/>
+            <w:vAlign w:val="center"/>
+            <w:shd w:fill="FFF2CC"/>
+            <w:tcMar>
+              <w:top w:w="90" w:type="dxa"/>
+              <w:start w:w="110" w:type="dxa"/>
+              <w:bottom w:w="90" w:type="dxa"/>
+              <w:end w:w="110" w:type="dxa"/>
+            </w:tcMar>
+          </w:tcPr>
+          <w:p>
+            <w:pPr>
+              <w:keepNext/>
+              <w:spacing w:before="20" w:after="20" w:line="240" w:lineRule="auto"/>
+            </w:pPr>
+            <w:r>
+              <w:rPr>
+                <w:rFonts w:ascii="Arial" w:hAnsi="Arial"/>
+                <w:b/>
+                <w:color w:val="1E1E1E"/>
+                <w:sz w:val="19"/>
+              </w:rPr>
+              <w:t>Boundary</w:t>
+            </w:r>
+          </w:p>
+        </w:tc>
+        <w:tc>
+          <w:tcPr>
+            <w:tcW w:type="dxa" w:w="2952"/>
+            <w:vAlign w:val="center"/>
+            <w:shd w:fill="FFF2CC"/>
+            <w:tcMar>
+              <w:top w:w="90" w:type="dxa"/>
+              <w:start w:w="110" w:type="dxa"/>
+              <w:bottom w:w="90" w:type="dxa"/>
+              <w:end w:w="110" w:type="dxa"/>
+            </w:tcMar>
+          </w:tcPr>
+          <w:p>
+            <w:pPr>
+              <w:keepNext/>
+              <w:spacing w:before="20" w:after="20" w:line="240" w:lineRule="auto"/>
+            </w:pPr>
+            <w:r>
+              <w:rPr>
+                <w:rFonts w:ascii="Arial" w:hAnsi="Arial"/>
+                <w:b/>
+                <w:color w:val="1E1E1E"/>
+                <w:sz w:val="19"/>
+              </w:rPr>
+              <w:t>Control</w:t>
+            </w:r>
+          </w:p>
+        </w:tc>
+        <w:tc>
+          <w:tcPr>
+            <w:tcW w:type="dxa" w:w="2952"/>
+            <w:vAlign w:val="center"/>
+            <w:shd w:fill="FFF2CC"/>
+            <w:tcMar>
+              <w:top w:w="90" w:type="dxa"/>
+              <w:start w:w="110" w:type="dxa"/>
+              <w:bottom w:w="90" w:type="dxa"/>
+              <w:end w:w="110" w:type="dxa"/>
+            </w:tcMar>
+          </w:tcPr>
+          <w:p>
+            <w:pPr>
+              <w:keepNext/>
+              <w:spacing w:before="20" w:after="20" w:line="240" w:lineRule="auto"/>
+            </w:pPr>
+            <w:r>
+              <w:rPr>
+                <w:rFonts w:ascii="Arial" w:hAnsi="Arial"/>
+                <w:b/>
+                <w:color w:val="1E1E1E"/>
+                <w:sz w:val="19"/>
+              </w:rPr>
+              <w:t>Entity</w:t>
+            </w:r>
+          </w:p>
+        </w:tc>
+      </w:tr>
+      <w:tr>
+        <w:trPr>
+          <w:cantSplit/>
+        </w:trPr>
+        <w:tc>
+          <w:tcPr>
+            <w:tcW w:type="dxa" w:w="2952"/>
+            <w:vAlign w:val="center"/>
+            <w:shd w:fill="FFFCF0"/>
+            <w:tcMar>
+              <w:top w:w="90" w:type="dxa"/>
+              <w:start w:w="110" w:type="dxa"/>
+              <w:bottom w:w="90" w:type="dxa"/>
+              <w:end w:w="110" w:type="dxa"/>
+            </w:tcMar>
+          </w:tcPr>
+          <w:p>
+            <w:pPr>
+              <w:spacing w:before="20" w:after="20" w:line="240" w:lineRule="auto"/>
+            </w:pPr>
+            <w:r>
+              <w:rPr>
+                <w:rFonts w:ascii="Arial" w:hAnsi="Arial"/>
+                <w:b w:val="0"/>
+                <w:color w:val="1E1E1E"/>
+                <w:sz w:val="19"/>
+              </w:rPr>
+              <w:t>RushOrderForm</w:t>
+              <w:br/>
+              <w:t>chooseRush()</w:t>
+              <w:br/>
+              <w:t>showQuote()</w:t>
+              <w:br/>
+              <w:t>confirmFee()</w:t>
+            </w:r>
+          </w:p>
+        </w:tc>
+        <w:tc>
+          <w:tcPr>
+            <w:tcW w:type="dxa" w:w="2952"/>
+            <w:vAlign w:val="center"/>
+            <w:shd w:fill="FFFCF0"/>
+            <w:tcMar>
+              <w:top w:w="90" w:type="dxa"/>
+              <w:start w:w="110" w:type="dxa"/>
+              <w:bottom w:w="90" w:type="dxa"/>
+              <w:end w:w="110" w:type="dxa"/>
+            </w:tcMar>
+          </w:tcPr>
+          <w:p>
+            <w:pPr>
+              <w:spacing w:before="20" w:after="20" w:line="240" w:lineRule="auto"/>
+            </w:pPr>
+            <w:r>
+              <w:rPr>
+                <w:rFonts w:ascii="Arial" w:hAnsi="Arial"/>
+                <w:b w:val="0"/>
+                <w:color w:val="1E1E1E"/>
+                <w:sz w:val="19"/>
+              </w:rPr>
+              <w:t>RushOrderController</w:t>
+              <w:br/>
+              <w:t>checkEligibility()</w:t>
+              <w:br/>
+              <w:t>quoteDelivery()</w:t>
+              <w:br/>
+              <w:t>createRushOrder()</w:t>
+              <w:br/>
+              <w:t>callPayOrder()</w:t>
+            </w:r>
+          </w:p>
+        </w:tc>
+        <w:tc>
+          <w:tcPr>
+            <w:tcW w:type="dxa" w:w="2952"/>
+            <w:vAlign w:val="center"/>
+            <w:shd w:fill="FFFCF0"/>
+            <w:tcMar>
+              <w:top w:w="90" w:type="dxa"/>
+              <w:start w:w="110" w:type="dxa"/>
+              <w:bottom w:w="90" w:type="dxa"/>
+              <w:end w:w="110" w:type="dxa"/>
+            </w:tcMar>
+          </w:tcPr>
+          <w:p>
+            <w:pPr>
+              <w:spacing w:before="20" w:after="20" w:line="240" w:lineRule="auto"/>
+            </w:pPr>
+            <w:r>
+              <w:rPr>
+                <w:rFonts w:ascii="Arial" w:hAnsi="Arial"/>
+                <w:b w:val="0"/>
+                <w:color w:val="1E1E1E"/>
+                <w:sz w:val="19"/>
+              </w:rPr>
+              <w:t>Product, InventoryItem</w:t>
+              <w:br/>
+              <w:t>DeliveryZone, RushDeliveryQuote</w:t>
+              <w:br/>
+              <w:t>Order, OrderLine</w:t>
+              <w:br/>
+              <w:t>ShippingAddress</w:t>
+              <w:br/>
+              <w:t>PaymentTransaction</w:t>
+            </w:r>
+          </w:p>
+        </w:tc>
+      </w:tr>
+    </w:tbl>
     <w:p>
       <w:pPr>
         <w:pStyle w:val="bai"/>
@@ -2008,7 +2225,40 @@
         <w:spacing w:before="40" w:after="160"/>
         <w:jc w:val="center"/>
       </w:pPr>
-      <w:r/>
+      <w:r>
+        <w:drawing>
+          <wp:inline xmlns:a="http://schemas.openxmlformats.org/drawingml/2006/main" xmlns:pic="http://schemas.openxmlformats.org/drawingml/2006/picture">
+            <wp:extent cx="5687568" cy="3017571"/>
+            <wp:docPr id="20" name="Picture 20"/>
+            <wp:cNvGraphicFramePr>
+              <a:graphicFrameLocks noChangeAspect="1"/>
+            </wp:cNvGraphicFramePr>
+            <a:graphic>
+              <a:graphicData uri="http://schemas.openxmlformats.org/drawingml/2006/picture">
+                <pic:pic>
+                  <pic:nvPicPr>
+                    <pic:cNvPr id="0" name="sequence_rush.png"/>
+                    <pic:cNvPicPr/>
+                  </pic:nvPicPr>
+                  <pic:blipFill>
+                    <a:blip r:embed="rId20"/>
+                    <a:stretch>
+                      <a:fillRect/>
+                    </a:stretch>
+                  </pic:blipFill>
+                  <pic:spPr>
+                    <a:xfrm>
+                      <a:off x="0" y="0"/>
+                      <a:ext cx="5687568" cy="3017571"/>
+                    </a:xfrm>
+                    <a:prstGeom prst="rect"/>
+                  </pic:spPr>
+                </pic:pic>
+              </a:graphicData>
+            </a:graphic>
+          </wp:inline>
+        </w:drawing>
+      </w:r>
     </w:p>
     <w:p>
       <w:pPr>
@@ -2064,7 +2314,40 @@
         <w:spacing w:before="40" w:after="160"/>
         <w:jc w:val="center"/>
       </w:pPr>
-      <w:r/>
+      <w:r>
+        <w:drawing>
+          <wp:inline xmlns:a="http://schemas.openxmlformats.org/drawingml/2006/main" xmlns:pic="http://schemas.openxmlformats.org/drawingml/2006/picture">
+            <wp:extent cx="5687568" cy="3357245"/>
+            <wp:docPr id="21" name="Picture 21"/>
+            <wp:cNvGraphicFramePr>
+              <a:graphicFrameLocks noChangeAspect="1"/>
+            </wp:cNvGraphicFramePr>
+            <a:graphic>
+              <a:graphicData uri="http://schemas.openxmlformats.org/drawingml/2006/picture">
+                <pic:pic>
+                  <pic:nvPicPr>
+                    <pic:cNvPr id="0" name="communication_rush.png"/>
+                    <pic:cNvPicPr/>
+                  </pic:nvPicPr>
+                  <pic:blipFill>
+                    <a:blip r:embed="rId21"/>
+                    <a:stretch>
+                      <a:fillRect/>
+                    </a:stretch>
+                  </pic:blipFill>
+                  <pic:spPr>
+                    <a:xfrm>
+                      <a:off x="0" y="0"/>
+                      <a:ext cx="5687568" cy="3357245"/>
+                    </a:xfrm>
+                    <a:prstGeom prst="rect"/>
+                  </pic:spPr>
+                </pic:pic>
+              </a:graphicData>
+            </a:graphic>
+          </wp:inline>
+        </w:drawing>
+      </w:r>
     </w:p>
     <w:p>
       <w:pPr>
@@ -2128,7 +2411,40 @@
         <w:spacing w:before="40" w:after="160"/>
         <w:jc w:val="center"/>
       </w:pPr>
-      <w:r/>
+      <w:r>
+        <w:drawing>
+          <wp:inline xmlns:a="http://schemas.openxmlformats.org/drawingml/2006/main" xmlns:pic="http://schemas.openxmlformats.org/drawingml/2006/picture">
+            <wp:extent cx="5687568" cy="3515233"/>
+            <wp:docPr id="22" name="Picture 22"/>
+            <wp:cNvGraphicFramePr>
+              <a:graphicFrameLocks noChangeAspect="1"/>
+            </wp:cNvGraphicFramePr>
+            <a:graphic>
+              <a:graphicData uri="http://schemas.openxmlformats.org/drawingml/2006/picture">
+                <pic:pic>
+                  <pic:nvPicPr>
+                    <pic:cNvPr id="0" name="class_rush.png"/>
+                    <pic:cNvPicPr/>
+                  </pic:nvPicPr>
+                  <pic:blipFill>
+                    <a:blip r:embed="rId22"/>
+                    <a:stretch>
+                      <a:fillRect/>
+                    </a:stretch>
+                  </pic:blipFill>
+                  <pic:spPr>
+                    <a:xfrm>
+                      <a:off x="0" y="0"/>
+                      <a:ext cx="5687568" cy="3515233"/>
+                    </a:xfrm>
+                    <a:prstGeom prst="rect"/>
+                  </pic:spPr>
+                </pic:pic>
+              </a:graphicData>
+            </a:graphic>
+          </wp:inline>
+        </w:drawing>
+      </w:r>
     </w:p>
     <w:p>
       <w:pPr>
@@ -2207,7 +2523,7 @@
           <w:color w:val="202020"/>
           <w:sz w:val="20"/>
         </w:rPr>
-        <w:t xml:space="preserve"/>
+        <w:t xml:space="preserve">Prompt đã dùng: </w:t>
       </w:r>
       <w:r>
         <w:rPr>
@@ -2216,7 +2532,7 @@
           <w:color w:val="202020"/>
           <w:sz w:val="20"/>
         </w:rPr>
-        <w:t/>
+        <w:t>Phân tích UC Place Rush Order của AIMS theo mẫu; thể hiện lớp, tương tác kiểm tra sản phẩm, vùng phục vụ, giờ nhận đơn, phụ phí, thời gian dự kiến và lời gọi UC002.</w:t>
       </w:r>
     </w:p>
     <w:p>
@@ -2245,7 +2561,7 @@
           <w:color w:val="202020"/>
           <w:sz w:val="20"/>
         </w:rPr>
-        <w:t xml:space="preserve"/>
+        <w:t xml:space="preserve">Đánh giá, điều chỉnh: </w:t>
       </w:r>
       <w:r>
         <w:rPr>
@@ -2254,7 +2570,7 @@
           <w:color w:val="202020"/>
           <w:sz w:val="20"/>
         </w:rPr>
-        <w:t/>
+        <w:t>Bổ sung điều kiện đủ hàng, sản phẩm hỗ trợ, địa chỉ và giờ nhận đơn; hiển thị phí cùng ETA trước xác nhận. Nếu không đủ điều kiện, Customer từ chối phí hoặc thanh toán chưa thành công thì không gắn ưu tiên và có thể quay về UC001.</w:t>
       </w:r>
     </w:p>
     <w:p>

</xml_diff>

<commit_message>
Complete Bài 3 UC Cancel Order
</commit_message>
<xml_diff>
--- a/VIII.HUST/Phân tích và xây dựng phần mềm/01_Word/Bai_tap_03_202490077_BachMinhQuang.docx
+++ b/VIII.HUST/Phân tích và xây dựng phần mềm/01_Word/Bai_tap_03_202490077_BachMinhQuang.docx
@@ -2667,6 +2667,227 @@
         </w:rPr>
       </w:pPr>
     </w:p>
+    <w:tbl>
+      <w:tblPr>
+        <w:tblW w:type="auto" w:w="0"/>
+        <w:tblLayout w:type="fixed"/>
+        <w:tblLook w:firstColumn="1" w:firstRow="1" w:lastColumn="0" w:lastRow="0" w:noHBand="0" w:noVBand="1" w:val="04A0"/>
+        <w:tblBorders>
+          <w:top w:val="single" w:sz="6" w:space="0" w:color="8A8A8A"/>
+          <w:left w:val="single" w:sz="6" w:space="0" w:color="8A8A8A"/>
+          <w:bottom w:val="single" w:sz="6" w:space="0" w:color="8A8A8A"/>
+          <w:right w:val="single" w:sz="6" w:space="0" w:color="8A8A8A"/>
+          <w:insideH w:val="single" w:sz="6" w:space="0" w:color="8A8A8A"/>
+          <w:insideV w:val="single" w:sz="6" w:space="0" w:color="8A8A8A"/>
+        </w:tblBorders>
+      </w:tblPr>
+      <w:tblGrid>
+        <w:gridCol w:w="2952"/>
+        <w:gridCol w:w="2952"/>
+        <w:gridCol w:w="2952"/>
+      </w:tblGrid>
+      <w:tr>
+        <w:trPr>
+          <w:cantSplit/>
+        </w:trPr>
+        <w:tc>
+          <w:tcPr>
+            <w:tcW w:type="dxa" w:w="2952"/>
+            <w:vAlign w:val="center"/>
+            <w:shd w:fill="FFF2CC"/>
+            <w:tcMar>
+              <w:top w:w="90" w:type="dxa"/>
+              <w:start w:w="110" w:type="dxa"/>
+              <w:bottom w:w="90" w:type="dxa"/>
+              <w:end w:w="110" w:type="dxa"/>
+            </w:tcMar>
+          </w:tcPr>
+          <w:p>
+            <w:pPr>
+              <w:keepNext/>
+              <w:spacing w:before="20" w:after="20" w:line="240" w:lineRule="auto"/>
+            </w:pPr>
+            <w:r>
+              <w:rPr>
+                <w:rFonts w:ascii="Arial" w:hAnsi="Arial"/>
+                <w:b/>
+                <w:color w:val="1E1E1E"/>
+                <w:sz w:val="19"/>
+              </w:rPr>
+              <w:t>Boundary</w:t>
+            </w:r>
+          </w:p>
+        </w:tc>
+        <w:tc>
+          <w:tcPr>
+            <w:tcW w:type="dxa" w:w="2952"/>
+            <w:vAlign w:val="center"/>
+            <w:shd w:fill="FFF2CC"/>
+            <w:tcMar>
+              <w:top w:w="90" w:type="dxa"/>
+              <w:start w:w="110" w:type="dxa"/>
+              <w:bottom w:w="90" w:type="dxa"/>
+              <w:end w:w="110" w:type="dxa"/>
+            </w:tcMar>
+          </w:tcPr>
+          <w:p>
+            <w:pPr>
+              <w:keepNext/>
+              <w:spacing w:before="20" w:after="20" w:line="240" w:lineRule="auto"/>
+            </w:pPr>
+            <w:r>
+              <w:rPr>
+                <w:rFonts w:ascii="Arial" w:hAnsi="Arial"/>
+                <w:b/>
+                <w:color w:val="1E1E1E"/>
+                <w:sz w:val="19"/>
+              </w:rPr>
+              <w:t>Control</w:t>
+            </w:r>
+          </w:p>
+        </w:tc>
+        <w:tc>
+          <w:tcPr>
+            <w:tcW w:type="dxa" w:w="2952"/>
+            <w:vAlign w:val="center"/>
+            <w:shd w:fill="FFF2CC"/>
+            <w:tcMar>
+              <w:top w:w="90" w:type="dxa"/>
+              <w:start w:w="110" w:type="dxa"/>
+              <w:bottom w:w="90" w:type="dxa"/>
+              <w:end w:w="110" w:type="dxa"/>
+            </w:tcMar>
+          </w:tcPr>
+          <w:p>
+            <w:pPr>
+              <w:keepNext/>
+              <w:spacing w:before="20" w:after="20" w:line="240" w:lineRule="auto"/>
+            </w:pPr>
+            <w:r>
+              <w:rPr>
+                <w:rFonts w:ascii="Arial" w:hAnsi="Arial"/>
+                <w:b/>
+                <w:color w:val="1E1E1E"/>
+                <w:sz w:val="19"/>
+              </w:rPr>
+              <w:t>Entity</w:t>
+            </w:r>
+          </w:p>
+        </w:tc>
+      </w:tr>
+      <w:tr>
+        <w:trPr>
+          <w:cantSplit/>
+        </w:trPr>
+        <w:tc>
+          <w:tcPr>
+            <w:tcW w:type="dxa" w:w="2952"/>
+            <w:vAlign w:val="center"/>
+            <w:shd w:fill="FFFCF0"/>
+            <w:tcMar>
+              <w:top w:w="90" w:type="dxa"/>
+              <w:start w:w="110" w:type="dxa"/>
+              <w:bottom w:w="90" w:type="dxa"/>
+              <w:end w:w="110" w:type="dxa"/>
+            </w:tcMar>
+          </w:tcPr>
+          <w:p>
+            <w:pPr>
+              <w:spacing w:before="20" w:after="20" w:line="240" w:lineRule="auto"/>
+            </w:pPr>
+            <w:r>
+              <w:rPr>
+                <w:rFonts w:ascii="Arial" w:hAnsi="Arial"/>
+                <w:b w:val="0"/>
+                <w:color w:val="1E1E1E"/>
+                <w:sz w:val="19"/>
+              </w:rPr>
+              <w:t>CancelOrderForm</w:t>
+              <w:br/>
+              <w:t>showStatus()</w:t>
+              <w:br/>
+              <w:t>enterReason()</w:t>
+              <w:br/>
+              <w:t>confirmCancel()</w:t>
+            </w:r>
+          </w:p>
+        </w:tc>
+        <w:tc>
+          <w:tcPr>
+            <w:tcW w:type="dxa" w:w="2952"/>
+            <w:vAlign w:val="center"/>
+            <w:shd w:fill="FFFCF0"/>
+            <w:tcMar>
+              <w:top w:w="90" w:type="dxa"/>
+              <w:start w:w="110" w:type="dxa"/>
+              <w:bottom w:w="90" w:type="dxa"/>
+              <w:end w:w="110" w:type="dxa"/>
+            </w:tcMar>
+          </w:tcPr>
+          <w:p>
+            <w:pPr>
+              <w:spacing w:before="20" w:after="20" w:line="240" w:lineRule="auto"/>
+            </w:pPr>
+            <w:r>
+              <w:rPr>
+                <w:rFonts w:ascii="Arial" w:hAnsi="Arial"/>
+                <w:b w:val="0"/>
+                <w:color w:val="1E1E1E"/>
+                <w:sz w:val="19"/>
+              </w:rPr>
+              <w:t>CancelOrderController</w:t>
+              <w:br/>
+              <w:t>verifyOwner()</w:t>
+              <w:br/>
+              <w:t>checkCancelable()</w:t>
+              <w:br/>
+              <w:t>cancelOrder()</w:t>
+              <w:br/>
+              <w:t>releaseStock()</w:t>
+              <w:br/>
+              <w:t>callRefundOrder()</w:t>
+            </w:r>
+          </w:p>
+        </w:tc>
+        <w:tc>
+          <w:tcPr>
+            <w:tcW w:type="dxa" w:w="2952"/>
+            <w:vAlign w:val="center"/>
+            <w:shd w:fill="FFFCF0"/>
+            <w:tcMar>
+              <w:top w:w="90" w:type="dxa"/>
+              <w:start w:w="110" w:type="dxa"/>
+              <w:bottom w:w="90" w:type="dxa"/>
+              <w:end w:w="110" w:type="dxa"/>
+            </w:tcMar>
+          </w:tcPr>
+          <w:p>
+            <w:pPr>
+              <w:spacing w:before="20" w:after="20" w:line="240" w:lineRule="auto"/>
+            </w:pPr>
+            <w:r>
+              <w:rPr>
+                <w:rFonts w:ascii="Arial" w:hAnsi="Arial"/>
+                <w:b w:val="0"/>
+                <w:color w:val="1E1E1E"/>
+                <w:sz w:val="19"/>
+              </w:rPr>
+              <w:t>Customer, Order</w:t>
+              <w:br/>
+              <w:t>DeliveryShipment</w:t>
+              <w:br/>
+              <w:t>StockReservation</w:t>
+              <w:br/>
+              <w:t>PaymentTransaction</w:t>
+              <w:br/>
+              <w:t>RefundTransaction</w:t>
+              <w:br/>
+              <w:t>OrderStatusHistory</w:t>
+            </w:r>
+          </w:p>
+        </w:tc>
+      </w:tr>
+    </w:tbl>
     <w:p>
       <w:pPr>
         <w:pStyle w:val="bai"/>
@@ -2728,7 +2949,40 @@
         <w:spacing w:before="40" w:after="160"/>
         <w:jc w:val="center"/>
       </w:pPr>
-      <w:r/>
+      <w:r>
+        <w:drawing>
+          <wp:inline xmlns:a="http://schemas.openxmlformats.org/drawingml/2006/main" xmlns:pic="http://schemas.openxmlformats.org/drawingml/2006/picture">
+            <wp:extent cx="5687568" cy="3187408"/>
+            <wp:docPr id="23" name="Picture 23"/>
+            <wp:cNvGraphicFramePr>
+              <a:graphicFrameLocks noChangeAspect="1"/>
+            </wp:cNvGraphicFramePr>
+            <a:graphic>
+              <a:graphicData uri="http://schemas.openxmlformats.org/drawingml/2006/picture">
+                <pic:pic>
+                  <pic:nvPicPr>
+                    <pic:cNvPr id="0" name="sequence_cancel.png"/>
+                    <pic:cNvPicPr/>
+                  </pic:nvPicPr>
+                  <pic:blipFill>
+                    <a:blip r:embed="rId23"/>
+                    <a:stretch>
+                      <a:fillRect/>
+                    </a:stretch>
+                  </pic:blipFill>
+                  <pic:spPr>
+                    <a:xfrm>
+                      <a:off x="0" y="0"/>
+                      <a:ext cx="5687568" cy="3187408"/>
+                    </a:xfrm>
+                    <a:prstGeom prst="rect"/>
+                  </pic:spPr>
+                </pic:pic>
+              </a:graphicData>
+            </a:graphic>
+          </wp:inline>
+        </w:drawing>
+      </w:r>
     </w:p>
     <w:p>
       <w:pPr>
@@ -2770,7 +3024,40 @@
         <w:spacing w:before="40" w:after="160"/>
         <w:jc w:val="center"/>
       </w:pPr>
-      <w:r/>
+      <w:r>
+        <w:drawing>
+          <wp:inline xmlns:a="http://schemas.openxmlformats.org/drawingml/2006/main" xmlns:pic="http://schemas.openxmlformats.org/drawingml/2006/picture">
+            <wp:extent cx="5687568" cy="3357245"/>
+            <wp:docPr id="24" name="Picture 24"/>
+            <wp:cNvGraphicFramePr>
+              <a:graphicFrameLocks noChangeAspect="1"/>
+            </wp:cNvGraphicFramePr>
+            <a:graphic>
+              <a:graphicData uri="http://schemas.openxmlformats.org/drawingml/2006/picture">
+                <pic:pic>
+                  <pic:nvPicPr>
+                    <pic:cNvPr id="0" name="communication_cancel.png"/>
+                    <pic:cNvPicPr/>
+                  </pic:nvPicPr>
+                  <pic:blipFill>
+                    <a:blip r:embed="rId24"/>
+                    <a:stretch>
+                      <a:fillRect/>
+                    </a:stretch>
+                  </pic:blipFill>
+                  <pic:spPr>
+                    <a:xfrm>
+                      <a:off x="0" y="0"/>
+                      <a:ext cx="5687568" cy="3357245"/>
+                    </a:xfrm>
+                    <a:prstGeom prst="rect"/>
+                  </pic:spPr>
+                </pic:pic>
+              </a:graphicData>
+            </a:graphic>
+          </wp:inline>
+        </w:drawing>
+      </w:r>
     </w:p>
     <w:p>
       <w:pPr>
@@ -2820,7 +3107,40 @@
         <w:spacing w:before="40" w:after="160"/>
         <w:jc w:val="center"/>
       </w:pPr>
-      <w:r/>
+      <w:r>
+        <w:drawing>
+          <wp:inline xmlns:a="http://schemas.openxmlformats.org/drawingml/2006/main" xmlns:pic="http://schemas.openxmlformats.org/drawingml/2006/picture">
+            <wp:extent cx="5687568" cy="3515233"/>
+            <wp:docPr id="25" name="Picture 25"/>
+            <wp:cNvGraphicFramePr>
+              <a:graphicFrameLocks noChangeAspect="1"/>
+            </wp:cNvGraphicFramePr>
+            <a:graphic>
+              <a:graphicData uri="http://schemas.openxmlformats.org/drawingml/2006/picture">
+                <pic:pic>
+                  <pic:nvPicPr>
+                    <pic:cNvPr id="0" name="class_cancel.png"/>
+                    <pic:cNvPicPr/>
+                  </pic:nvPicPr>
+                  <pic:blipFill>
+                    <a:blip r:embed="rId25"/>
+                    <a:stretch>
+                      <a:fillRect/>
+                    </a:stretch>
+                  </pic:blipFill>
+                  <pic:spPr>
+                    <a:xfrm>
+                      <a:off x="0" y="0"/>
+                      <a:ext cx="5687568" cy="3515233"/>
+                    </a:xfrm>
+                    <a:prstGeom prst="rect"/>
+                  </pic:spPr>
+                </pic:pic>
+              </a:graphicData>
+            </a:graphic>
+          </wp:inline>
+        </w:drawing>
+      </w:r>
     </w:p>
     <w:p>
       <w:pPr>
@@ -2899,7 +3219,7 @@
           <w:color w:val="202020"/>
           <w:sz w:val="20"/>
         </w:rPr>
-        <w:t xml:space="preserve"/>
+        <w:t xml:space="preserve">Prompt đã dùng: </w:t>
       </w:r>
       <w:r>
         <w:rPr>
@@ -2908,7 +3228,7 @@
           <w:color w:val="202020"/>
           <w:sz w:val="20"/>
         </w:rPr>
-        <w:t/>
+        <w:t>Phân tích UC Cancel Order theo mẫu; xác thực chủ đơn, kiểm tra đơn chưa bàn giao, xác nhận hủy, giải phóng hàng và gọi UC005 khi đơn đã thanh toán.</w:t>
       </w:r>
     </w:p>
     <w:p>
@@ -2937,7 +3257,7 @@
           <w:color w:val="202020"/>
           <w:sz w:val="20"/>
         </w:rPr>
-        <w:t xml:space="preserve"/>
+        <w:t xml:space="preserve">Đánh giá, điều chỉnh: </w:t>
       </w:r>
       <w:r>
         <w:rPr>
@@ -2946,7 +3266,7 @@
           <w:color w:val="202020"/>
           <w:sz w:val="20"/>
         </w:rPr>
-        <w:t/>
+        <w:t>Giới hạn hủy ở đơn đúng chủ sở hữu và chưa bàn giao. Tách CANCELLED khỏi trạng thái hoàn tiền; đơn chưa thu tiền bỏ qua UC005, còn timeout khi hoàn tiền được giữ REFUND_PENDING.</w:t>
       </w:r>
     </w:p>
     <w:p>

</xml_diff>

<commit_message>
Complete Bài 3 UC Refund Order
</commit_message>
<xml_diff>
--- a/VIII.HUST/Phân tích và xây dựng phần mềm/01_Word/Bai_tap_03_202490077_BachMinhQuang.docx
+++ b/VIII.HUST/Phân tích và xây dựng phần mềm/01_Word/Bai_tap_03_202490077_BachMinhQuang.docx
@@ -3362,6 +3362,221 @@
         </w:rPr>
       </w:pPr>
     </w:p>
+    <w:tbl>
+      <w:tblPr>
+        <w:tblW w:type="auto" w:w="0"/>
+        <w:tblLayout w:type="fixed"/>
+        <w:tblLook w:firstColumn="1" w:firstRow="1" w:lastColumn="0" w:lastRow="0" w:noHBand="0" w:noVBand="1" w:val="04A0"/>
+        <w:tblBorders>
+          <w:top w:val="single" w:sz="6" w:space="0" w:color="8A8A8A"/>
+          <w:left w:val="single" w:sz="6" w:space="0" w:color="8A8A8A"/>
+          <w:bottom w:val="single" w:sz="6" w:space="0" w:color="8A8A8A"/>
+          <w:right w:val="single" w:sz="6" w:space="0" w:color="8A8A8A"/>
+          <w:insideH w:val="single" w:sz="6" w:space="0" w:color="8A8A8A"/>
+          <w:insideV w:val="single" w:sz="6" w:space="0" w:color="8A8A8A"/>
+        </w:tblBorders>
+      </w:tblPr>
+      <w:tblGrid>
+        <w:gridCol w:w="2952"/>
+        <w:gridCol w:w="2952"/>
+        <w:gridCol w:w="2952"/>
+      </w:tblGrid>
+      <w:tr>
+        <w:trPr>
+          <w:cantSplit/>
+        </w:trPr>
+        <w:tc>
+          <w:tcPr>
+            <w:tcW w:type="dxa" w:w="2952"/>
+            <w:vAlign w:val="center"/>
+            <w:shd w:fill="FFF2CC"/>
+            <w:tcMar>
+              <w:top w:w="90" w:type="dxa"/>
+              <w:start w:w="110" w:type="dxa"/>
+              <w:bottom w:w="90" w:type="dxa"/>
+              <w:end w:w="110" w:type="dxa"/>
+            </w:tcMar>
+          </w:tcPr>
+          <w:p>
+            <w:pPr>
+              <w:keepNext/>
+              <w:spacing w:before="20" w:after="20" w:line="240" w:lineRule="auto"/>
+            </w:pPr>
+            <w:r>
+              <w:rPr>
+                <w:rFonts w:ascii="Arial" w:hAnsi="Arial"/>
+                <w:b/>
+                <w:color w:val="1E1E1E"/>
+                <w:sz w:val="19"/>
+              </w:rPr>
+              <w:t>Boundary</w:t>
+            </w:r>
+          </w:p>
+        </w:tc>
+        <w:tc>
+          <w:tcPr>
+            <w:tcW w:type="dxa" w:w="2952"/>
+            <w:vAlign w:val="center"/>
+            <w:shd w:fill="FFF2CC"/>
+            <w:tcMar>
+              <w:top w:w="90" w:type="dxa"/>
+              <w:start w:w="110" w:type="dxa"/>
+              <w:bottom w:w="90" w:type="dxa"/>
+              <w:end w:w="110" w:type="dxa"/>
+            </w:tcMar>
+          </w:tcPr>
+          <w:p>
+            <w:pPr>
+              <w:keepNext/>
+              <w:spacing w:before="20" w:after="20" w:line="240" w:lineRule="auto"/>
+            </w:pPr>
+            <w:r>
+              <w:rPr>
+                <w:rFonts w:ascii="Arial" w:hAnsi="Arial"/>
+                <w:b/>
+                <w:color w:val="1E1E1E"/>
+                <w:sz w:val="19"/>
+              </w:rPr>
+              <w:t>Control</w:t>
+            </w:r>
+          </w:p>
+        </w:tc>
+        <w:tc>
+          <w:tcPr>
+            <w:tcW w:type="dxa" w:w="2952"/>
+            <w:vAlign w:val="center"/>
+            <w:shd w:fill="FFF2CC"/>
+            <w:tcMar>
+              <w:top w:w="90" w:type="dxa"/>
+              <w:start w:w="110" w:type="dxa"/>
+              <w:bottom w:w="90" w:type="dxa"/>
+              <w:end w:w="110" w:type="dxa"/>
+            </w:tcMar>
+          </w:tcPr>
+          <w:p>
+            <w:pPr>
+              <w:keepNext/>
+              <w:spacing w:before="20" w:after="20" w:line="240" w:lineRule="auto"/>
+            </w:pPr>
+            <w:r>
+              <w:rPr>
+                <w:rFonts w:ascii="Arial" w:hAnsi="Arial"/>
+                <w:b/>
+                <w:color w:val="1E1E1E"/>
+                <w:sz w:val="19"/>
+              </w:rPr>
+              <w:t>Entity</w:t>
+            </w:r>
+          </w:p>
+        </w:tc>
+      </w:tr>
+      <w:tr>
+        <w:trPr>
+          <w:cantSplit/>
+        </w:trPr>
+        <w:tc>
+          <w:tcPr>
+            <w:tcW w:type="dxa" w:w="2952"/>
+            <w:vAlign w:val="center"/>
+            <w:shd w:fill="FFFCF0"/>
+            <w:tcMar>
+              <w:top w:w="90" w:type="dxa"/>
+              <w:start w:w="110" w:type="dxa"/>
+              <w:bottom w:w="90" w:type="dxa"/>
+              <w:end w:w="110" w:type="dxa"/>
+            </w:tcMar>
+          </w:tcPr>
+          <w:p>
+            <w:pPr>
+              <w:spacing w:before="20" w:after="20" w:line="240" w:lineRule="auto"/>
+            </w:pPr>
+            <w:r>
+              <w:rPr>
+                <w:rFonts w:ascii="Arial" w:hAnsi="Arial"/>
+                <w:b w:val="0"/>
+                <w:color w:val="1E1E1E"/>
+                <w:sz w:val="19"/>
+              </w:rPr>
+              <w:t>RefundOrderForm</w:t>
+              <w:br/>
+              <w:t>showEligibleAmount()</w:t>
+              <w:br/>
+              <w:t>enterReason()</w:t>
+              <w:br/>
+              <w:t>confirmRefund()</w:t>
+            </w:r>
+          </w:p>
+        </w:tc>
+        <w:tc>
+          <w:tcPr>
+            <w:tcW w:type="dxa" w:w="2952"/>
+            <w:vAlign w:val="center"/>
+            <w:shd w:fill="FFFCF0"/>
+            <w:tcMar>
+              <w:top w:w="90" w:type="dxa"/>
+              <w:start w:w="110" w:type="dxa"/>
+              <w:bottom w:w="90" w:type="dxa"/>
+              <w:end w:w="110" w:type="dxa"/>
+            </w:tcMar>
+          </w:tcPr>
+          <w:p>
+            <w:pPr>
+              <w:spacing w:before="20" w:after="20" w:line="240" w:lineRule="auto"/>
+            </w:pPr>
+            <w:r>
+              <w:rPr>
+                <w:rFonts w:ascii="Arial" w:hAnsi="Arial"/>
+                <w:b w:val="0"/>
+                <w:color w:val="1E1E1E"/>
+                <w:sz w:val="19"/>
+              </w:rPr>
+              <w:t>RefundOrderController</w:t>
+              <w:br/>
+              <w:t>checkEligibility()</w:t>
+              <w:br/>
+              <w:t>calculateRefundable()</w:t>
+              <w:br/>
+              <w:t>createIdempotentRequest()</w:t>
+              <w:br/>
+              <w:t>resolvePending()</w:t>
+            </w:r>
+          </w:p>
+        </w:tc>
+        <w:tc>
+          <w:tcPr>
+            <w:tcW w:type="dxa" w:w="2952"/>
+            <w:vAlign w:val="center"/>
+            <w:shd w:fill="FFFCF0"/>
+            <w:tcMar>
+              <w:top w:w="90" w:type="dxa"/>
+              <w:start w:w="110" w:type="dxa"/>
+              <w:bottom w:w="90" w:type="dxa"/>
+              <w:end w:w="110" w:type="dxa"/>
+            </w:tcMar>
+          </w:tcPr>
+          <w:p>
+            <w:pPr>
+              <w:spacing w:before="20" w:after="20" w:line="240" w:lineRule="auto"/>
+            </w:pPr>
+            <w:r>
+              <w:rPr>
+                <w:rFonts w:ascii="Arial" w:hAnsi="Arial"/>
+                <w:b w:val="0"/>
+                <w:color w:val="1E1E1E"/>
+                <w:sz w:val="19"/>
+              </w:rPr>
+              <w:t>Order, PaymentTransaction</w:t>
+              <w:br/>
+              <w:t>RefundTransaction</w:t>
+              <w:br/>
+              <w:t>CardToken/InterbankResult</w:t>
+              <w:br/>
+              <w:t>OrderStatusHistory</w:t>
+            </w:r>
+          </w:p>
+        </w:tc>
+      </w:tr>
+    </w:tbl>
     <w:p>
       <w:pPr>
         <w:pStyle w:val="bai"/>
@@ -3423,7 +3638,40 @@
         <w:spacing w:before="40" w:after="160"/>
         <w:jc w:val="center"/>
       </w:pPr>
-      <w:r/>
+      <w:r>
+        <w:drawing>
+          <wp:inline xmlns:a="http://schemas.openxmlformats.org/drawingml/2006/main" xmlns:pic="http://schemas.openxmlformats.org/drawingml/2006/picture">
+            <wp:extent cx="5687568" cy="3187408"/>
+            <wp:docPr id="26" name="Picture 26"/>
+            <wp:cNvGraphicFramePr>
+              <a:graphicFrameLocks noChangeAspect="1"/>
+            </wp:cNvGraphicFramePr>
+            <a:graphic>
+              <a:graphicData uri="http://schemas.openxmlformats.org/drawingml/2006/picture">
+                <pic:pic>
+                  <pic:nvPicPr>
+                    <pic:cNvPr id="0" name="sequence_refund.png"/>
+                    <pic:cNvPicPr/>
+                  </pic:nvPicPr>
+                  <pic:blipFill>
+                    <a:blip r:embed="rId26"/>
+                    <a:stretch>
+                      <a:fillRect/>
+                    </a:stretch>
+                  </pic:blipFill>
+                  <pic:spPr>
+                    <a:xfrm>
+                      <a:off x="0" y="0"/>
+                      <a:ext cx="5687568" cy="3187408"/>
+                    </a:xfrm>
+                    <a:prstGeom prst="rect"/>
+                  </pic:spPr>
+                </pic:pic>
+              </a:graphicData>
+            </a:graphic>
+          </wp:inline>
+        </w:drawing>
+      </w:r>
     </w:p>
     <w:p>
       <w:pPr>
@@ -3465,7 +3713,40 @@
         <w:spacing w:before="40" w:after="160"/>
         <w:jc w:val="center"/>
       </w:pPr>
-      <w:r/>
+      <w:r>
+        <w:drawing>
+          <wp:inline xmlns:a="http://schemas.openxmlformats.org/drawingml/2006/main" xmlns:pic="http://schemas.openxmlformats.org/drawingml/2006/picture">
+            <wp:extent cx="5687568" cy="3357245"/>
+            <wp:docPr id="27" name="Picture 27"/>
+            <wp:cNvGraphicFramePr>
+              <a:graphicFrameLocks noChangeAspect="1"/>
+            </wp:cNvGraphicFramePr>
+            <a:graphic>
+              <a:graphicData uri="http://schemas.openxmlformats.org/drawingml/2006/picture">
+                <pic:pic>
+                  <pic:nvPicPr>
+                    <pic:cNvPr id="0" name="communication_refund.png"/>
+                    <pic:cNvPicPr/>
+                  </pic:nvPicPr>
+                  <pic:blipFill>
+                    <a:blip r:embed="rId27"/>
+                    <a:stretch>
+                      <a:fillRect/>
+                    </a:stretch>
+                  </pic:blipFill>
+                  <pic:spPr>
+                    <a:xfrm>
+                      <a:off x="0" y="0"/>
+                      <a:ext cx="5687568" cy="3357245"/>
+                    </a:xfrm>
+                    <a:prstGeom prst="rect"/>
+                  </pic:spPr>
+                </pic:pic>
+              </a:graphicData>
+            </a:graphic>
+          </wp:inline>
+        </w:drawing>
+      </w:r>
     </w:p>
     <w:p>
       <w:pPr>
@@ -3516,7 +3797,40 @@
         <w:spacing w:before="40" w:after="160"/>
         <w:jc w:val="center"/>
       </w:pPr>
-      <w:r/>
+      <w:r>
+        <w:drawing>
+          <wp:inline xmlns:a="http://schemas.openxmlformats.org/drawingml/2006/main" xmlns:pic="http://schemas.openxmlformats.org/drawingml/2006/picture">
+            <wp:extent cx="5687568" cy="2745042"/>
+            <wp:docPr id="28" name="Picture 28"/>
+            <wp:cNvGraphicFramePr>
+              <a:graphicFrameLocks noChangeAspect="1"/>
+            </wp:cNvGraphicFramePr>
+            <a:graphic>
+              <a:graphicData uri="http://schemas.openxmlformats.org/drawingml/2006/picture">
+                <pic:pic>
+                  <pic:nvPicPr>
+                    <pic:cNvPr id="0" name="class_refund.png"/>
+                    <pic:cNvPicPr/>
+                  </pic:nvPicPr>
+                  <pic:blipFill>
+                    <a:blip r:embed="rId28"/>
+                    <a:stretch>
+                      <a:fillRect/>
+                    </a:stretch>
+                  </pic:blipFill>
+                  <pic:spPr>
+                    <a:xfrm>
+                      <a:off x="0" y="0"/>
+                      <a:ext cx="5687568" cy="2745042"/>
+                    </a:xfrm>
+                    <a:prstGeom prst="rect"/>
+                  </pic:spPr>
+                </pic:pic>
+              </a:graphicData>
+            </a:graphic>
+          </wp:inline>
+        </w:drawing>
+      </w:r>
     </w:p>
     <w:p>
       <w:pPr>
@@ -3595,7 +3909,7 @@
           <w:color w:val="202020"/>
           <w:sz w:val="20"/>
         </w:rPr>
-        <w:t xml:space="preserve"/>
+        <w:t xml:space="preserve">Prompt đã dùng: </w:t>
       </w:r>
       <w:r>
         <w:rPr>
@@ -3604,7 +3918,7 @@
           <w:color w:val="202020"/>
           <w:sz w:val="20"/>
         </w:rPr>
-        <w:t/>
+        <w:t>Phân tích UC Refund Order với Customer và Interbank; giới hạn theo số tiền đã thu, ngăn hoàn trùng, xử lý từ chối/timeout và lưu mã giao dịch tham chiếu.</w:t>
       </w:r>
     </w:p>
     <w:p>
@@ -3633,7 +3947,7 @@
           <w:color w:val="202020"/>
           <w:sz w:val="20"/>
         </w:rPr>
-        <w:t xml:space="preserve"/>
+        <w:t xml:space="preserve">Đánh giá, điều chỉnh: </w:t>
       </w:r>
       <w:r>
         <w:rPr>
@@ -3642,7 +3956,7 @@
           <w:color w:val="202020"/>
           <w:sz w:val="20"/>
         </w:rPr>
-        <w:t/>
+        <w:t>Tính khoản còn hoàn từ số đã thu trừ số đã hoàn và đang chờ; dùng khóa idempotency và tra cứu trạng thái trước khi gửi lại sau timeout. Chỉ ghi REFUNDED khi Interbank xác nhận.</w:t>
       </w:r>
     </w:p>
     <w:p>

</xml_diff>

<commit_message>
Add Bài 3 merged analysis diagram
</commit_message>
<xml_diff>
--- a/VIII.HUST/Phân tích và xây dựng phần mềm/01_Word/Bai_tap_03_202490077_BachMinhQuang.docx
+++ b/VIII.HUST/Phân tích và xây dựng phần mềm/01_Word/Bai_tap_03_202490077_BachMinhQuang.docx
@@ -4093,7 +4093,40 @@
         <w:spacing w:before="40" w:after="160"/>
         <w:jc w:val="center"/>
       </w:pPr>
-      <w:r/>
+      <w:r>
+        <w:drawing>
+          <wp:inline xmlns:a="http://schemas.openxmlformats.org/drawingml/2006/main" xmlns:pic="http://schemas.openxmlformats.org/drawingml/2006/picture">
+            <wp:extent cx="5687568" cy="3515233"/>
+            <wp:docPr id="29" name="Picture 29"/>
+            <wp:cNvGraphicFramePr>
+              <a:graphicFrameLocks noChangeAspect="1"/>
+            </wp:cNvGraphicFramePr>
+            <a:graphic>
+              <a:graphicData uri="http://schemas.openxmlformats.org/drawingml/2006/picture">
+                <pic:pic>
+                  <pic:nvPicPr>
+                    <pic:cNvPr id="0" name="class_merged.png"/>
+                    <pic:cNvPicPr/>
+                  </pic:nvPicPr>
+                  <pic:blipFill>
+                    <a:blip r:embed="rId29"/>
+                    <a:stretch>
+                      <a:fillRect/>
+                    </a:stretch>
+                  </pic:blipFill>
+                  <pic:spPr>
+                    <a:xfrm>
+                      <a:off x="0" y="0"/>
+                      <a:ext cx="5687568" cy="3515233"/>
+                    </a:xfrm>
+                    <a:prstGeom prst="rect"/>
+                  </pic:spPr>
+                </pic:pic>
+              </a:graphicData>
+            </a:graphic>
+          </wp:inline>
+        </w:drawing>
+      </w:r>
     </w:p>
     <w:p>
       <w:pPr>
@@ -4172,7 +4205,7 @@
           <w:color w:val="202020"/>
           <w:sz w:val="20"/>
         </w:rPr>
-        <w:t xml:space="preserve"/>
+        <w:t xml:space="preserve">Prompt đã dùng: </w:t>
       </w:r>
       <w:r>
         <w:rPr>
@@ -4181,7 +4214,7 @@
           <w:color w:val="202020"/>
           <w:sz w:val="20"/>
         </w:rPr>
-        <w:t/>
+        <w:t>Hợp nhất analysis class diagram cho UC001–UC005; gộp các lớp dùng chung, giữ riêng boundary/control theo trách nhiệm, và thể hiện luồng gọi Pay Order, Refund Order cùng giao nhanh.</w:t>
       </w:r>
     </w:p>
     <w:p>
@@ -4210,7 +4243,7 @@
           <w:color w:val="202020"/>
           <w:sz w:val="20"/>
         </w:rPr>
-        <w:t xml:space="preserve"/>
+        <w:t xml:space="preserve">Đánh giá, điều chỉnh: </w:t>
       </w:r>
       <w:r>
         <w:rPr>
@@ -4219,7 +4252,7 @@
           <w:color w:val="202020"/>
           <w:sz w:val="20"/>
         </w:rPr>
-        <w:t/>
+        <w:t>Dùng một Customer, Order, OrderLine và PaymentTransaction cho các UC; Rush là tùy chọn giao của Order. UC004 gọi UC005 khi đã thu tiền; các transaction và kết quả từ Interbank vẫn được lưu riêng để tránh trùng hoặc báo sai trạng thái.</w:t>
       </w:r>
     </w:p>
     <w:p>

</xml_diff>